<commit_message>
Add {WELLHEAD_QTY} placeholder for stateline sticker
- Stateline pallet wrap template now uses {WELLHEAD_QTY} instead of
  hardcoded (1) in "Additional Req'd Stateline Equipment for (X) Wellhead"
- Added Wellhead Qty input with dropdown history to bulk generate form
- Wired WELLHEAD_QTY into field_values and form reset

Co-Authored-By: Claude Opus 4.6 <noreply@anthropic.com>
</commit_message>
<xml_diff>
--- a/helpful documents/Template_Library_Samples/convert for me/RIO Stickers #1-pallet wrap stateline.docx
+++ b/helpful documents/Template_Library_Samples/convert for me/RIO Stickers #1-pallet wrap stateline.docx
@@ -59,7 +59,7 @@
                 <w:rFonts w:ascii="Arial" w:hAnsi="Arial"/>
                 <w:sz w:val="70"/>
               </w:rPr>
-              <w:t>Additional Req'd Stateline Equipment for (1) Wellhead</w:t>
+              <w:t>Additional Req'd Stateline Equipment for ({WELLHEAD_QTY}) Wellhead</w:t>
             </w:r>
           </w:p>
           <w:p>
@@ -82,7 +82,7 @@
             </w:pPr>
             <w:r>
               <w:rPr>
-                <w:rFonts w:ascii="Arial Black" w:hAnsi="Arial Black"/>
+                <w:rFonts w:ascii="Arial" w:hAnsi="Arial"/>
                 <w:b/>
                 <w:sz w:val="86"/>
               </w:rPr>
@@ -130,7 +130,7 @@
                 <w:rFonts w:ascii="Arial" w:hAnsi="Arial"/>
                 <w:sz w:val="70"/>
               </w:rPr>
-              <w:t>Additional Req'd Stateline Equipment for (1) Wellhead</w:t>
+              <w:t>Additional Req'd Stateline Equipment for ({WELLHEAD_QTY}) Wellhead</w:t>
             </w:r>
           </w:p>
           <w:p>
@@ -153,7 +153,7 @@
             </w:pPr>
             <w:r>
               <w:rPr>
-                <w:rFonts w:ascii="Arial Black" w:hAnsi="Arial Black"/>
+                <w:rFonts w:ascii="Arial" w:hAnsi="Arial"/>
                 <w:b/>
                 <w:sz w:val="86"/>
               </w:rPr>

</xml_diff>